<commit_message>
docs: recapture Module 9 evidence M9-01..M9-10 to match requirements
</commit_message>
<xml_diff>
--- a/docs/PUNZAL_Juner_Module9_Software_Evolution.docx
+++ b/docs/PUNZAL_Juner_Module9_Software_Evolution.docx
@@ -282,15 +282,15 @@
         <w:pStyle w:val="Heading1"/>
       </w:pPr>
       <w:r>
-        <w:t xml:space="preserve">M9-01: Login Page</w:t>
-      </w:r>
-    </w:p>
-    <w:p>
-      <w:pPr>
-        <w:spacing w:line="240"/>
-      </w:pPr>
-      <w:r>
-        <w:t xml:space="preserve">Secure administrator login screen (PBKDF2 password hashing).</w:t>
+        <w:t xml:space="preserve">M9-01: Module 6 — Architecture Baseline</w:t>
+      </w:r>
+    </w:p>
+    <w:p>
+      <w:pPr>
+        <w:spacing w:line="240"/>
+      </w:pPr>
+      <w:r>
+        <w:t xml:space="preserve">Architecture baseline: Vue 3 SPA, Vite, Tailwind CSS, localStorage, Student { id, name, course, email }.</w:t>
       </w:r>
     </w:p>
     <w:p>
@@ -357,15 +357,15 @@
         <w:pStyle w:val="Heading1"/>
       </w:pPr>
       <w:r>
-        <w:t xml:space="preserve">M9-02: Register Page</w:t>
-      </w:r>
-    </w:p>
-    <w:p>
-      <w:pPr>
-        <w:spacing w:line="240"/>
-      </w:pPr>
-      <w:r>
-        <w:t xml:space="preserve">Administrator account registration screen.</w:t>
+        <w:t xml:space="preserve">M9-02: Module 7 — System Before Change</w:t>
+      </w:r>
+    </w:p>
+    <w:p>
+      <w:pPr>
+        <w:spacing w:line="240"/>
+      </w:pPr>
+      <w:r>
+        <w:t xml:space="preserve">The working application before CR-M9-01, with secure administrator login (PBKDF2).</w:t>
       </w:r>
     </w:p>
     <w:p>
@@ -432,15 +432,15 @@
         <w:pStyle w:val="Heading1"/>
       </w:pPr>
       <w:r>
-        <w:t xml:space="preserve">M9-03: Dashboard</w:t>
-      </w:r>
-    </w:p>
-    <w:p>
-      <w:pPr>
-        <w:spacing w:line="240"/>
-      </w:pPr>
-      <w:r>
-        <w:t xml:space="preserve">Main dashboard after login with attendance statistics.</w:t>
+        <w:t xml:space="preserve">M9-03: Module 8 — Test Baseline</w:t>
+      </w:r>
+    </w:p>
+    <w:p>
+      <w:pPr>
+        <w:spacing w:line="240"/>
+      </w:pPr>
+      <w:r>
+        <w:t xml:space="preserve">Test baseline: manual + automated tests, defect DEF-01 fixed before the change.</w:t>
       </w:r>
     </w:p>
     <w:p>
@@ -507,15 +507,15 @@
         <w:pStyle w:val="Heading1"/>
       </w:pPr>
       <w:r>
-        <w:t xml:space="preserve">M9-04: Students Page</w:t>
-      </w:r>
-    </w:p>
-    <w:p>
-      <w:pPr>
-        <w:spacing w:line="240"/>
-      </w:pPr>
-      <w:r>
-        <w:t xml:space="preserve">Students page with "Browse by class" organization (Module 9 feature).</w:t>
+        <w:t xml:space="preserve">M9-04: Change Request — CR-M9-01</w:t>
+      </w:r>
+    </w:p>
+    <w:p>
+      <w:pPr>
+        <w:spacing w:line="240"/>
+      </w:pPr>
+      <w:r>
+        <w:t xml:space="preserve">CR-M9-01: Organize students by year level and section (Adaptive Maintenance).</w:t>
       </w:r>
     </w:p>
     <w:p>
@@ -582,15 +582,15 @@
         <w:pStyle w:val="Heading1"/>
       </w:pPr>
       <w:r>
-        <w:t xml:space="preserve">M9-05: Add Student Form</w:t>
-      </w:r>
-    </w:p>
-    <w:p>
-      <w:pPr>
-        <w:spacing w:line="240"/>
-      </w:pPr>
-      <w:r>
-        <w:t xml:space="preserve">Student form with explicit Year level (1-4) and Section (A-Z) fields.</w:t>
+        <w:t xml:space="preserve">M9-05: Updated Architecture — Module 9</w:t>
+      </w:r>
+    </w:p>
+    <w:p>
+      <w:pPr>
+        <w:spacing w:line="240"/>
+      </w:pPr>
+      <w:r>
+        <w:t xml:space="preserve">Updated architecture with normalizeStudent(), yearLevel and section fields, backward compatible.</w:t>
       </w:r>
     </w:p>
     <w:p>
@@ -657,15 +657,15 @@
         <w:pStyle w:val="Heading1"/>
       </w:pPr>
       <w:r>
-        <w:t xml:space="preserve">M9-06: Browse by Class (Evolved System)</w:t>
-      </w:r>
-    </w:p>
-    <w:p>
-      <w:pPr>
-        <w:spacing w:line="240"/>
-      </w:pPr>
-      <w:r>
-        <w:t xml:space="preserve">Year-level cards with section groupings and student counts.</w:t>
+        <w:t xml:space="preserve">M9-06: Implementation — Code Changes</w:t>
+      </w:r>
+    </w:p>
+    <w:p>
+      <w:pPr>
+        <w:spacing w:line="240"/>
+      </w:pPr>
+      <w:r>
+        <w:t xml:space="preserve">Real code changes in useStudents.js (normalizeStudent, validation) and Students.vue (Browse by class, filters).</w:t>
       </w:r>
     </w:p>
     <w:p>
@@ -732,15 +732,15 @@
         <w:pStyle w:val="Heading1"/>
       </w:pPr>
       <w:r>
-        <w:t xml:space="preserve">M9-07: Year / Section Filtering</w:t>
-      </w:r>
-    </w:p>
-    <w:p>
-      <w:pPr>
-        <w:spacing w:line="240"/>
-      </w:pPr>
-      <w:r>
-        <w:t xml:space="preserve">Filtering students by year level and section, combined with search.</w:t>
+        <w:t xml:space="preserve">M9-07: Evolved System — Working Implementation</w:t>
+      </w:r>
+    </w:p>
+    <w:p>
+      <w:pPr>
+        <w:spacing w:line="240"/>
+      </w:pPr>
+      <w:r>
+        <w:t xml:space="preserve">Evolved system live: Browse-by-class cards, year/section filters, and the organized student list.</w:t>
       </w:r>
     </w:p>
     <w:p>
@@ -807,15 +807,15 @@
         <w:pStyle w:val="Heading1"/>
       </w:pPr>
       <w:r>
-        <w:t xml:space="preserve">M9-08: Attendance Page</w:t>
-      </w:r>
-    </w:p>
-    <w:p>
-      <w:pPr>
-        <w:spacing w:line="240"/>
-      </w:pPr>
-      <w:r>
-        <w:t xml:space="preserve">Attendance recording preserved and fully functional after evolution.</w:t>
+        <w:t xml:space="preserve">M9-08: Updated Test Cases</w:t>
+      </w:r>
+    </w:p>
+    <w:p>
+      <w:pPr>
+        <w:spacing w:line="240"/>
+      </w:pPr>
+      <w:r>
+        <w:t xml:space="preserve">Module 9 unit tests executed against the evolved system — all passing, zero regressions.</w:t>
       </w:r>
     </w:p>
     <w:p>
@@ -882,15 +882,15 @@
         <w:pStyle w:val="Heading1"/>
       </w:pPr>
       <w:r>
-        <w:t xml:space="preserve">M9-09: Settings Page</w:t>
-      </w:r>
-    </w:p>
-    <w:p>
-      <w:pPr>
-        <w:spacing w:line="240"/>
-      </w:pPr>
-      <w:r>
-        <w:t xml:space="preserve">System settings including dark mode and system information management.</w:t>
+        <w:t xml:space="preserve">M9-09: Build &amp; Test Results</w:t>
+      </w:r>
+    </w:p>
+    <w:p>
+      <w:pPr>
+        <w:spacing w:line="240"/>
+      </w:pPr>
+      <w:r>
+        <w:t xml:space="preserve">Real production build output — 26 modules transformed, zero errors, production ready.</w:t>
       </w:r>
     </w:p>
     <w:p>
@@ -957,15 +957,15 @@
         <w:pStyle w:val="Heading1"/>
       </w:pPr>
       <w:r>
-        <w:t xml:space="preserve">M9-10: Reports Page</w:t>
-      </w:r>
-    </w:p>
-    <w:p>
-      <w:pPr>
-        <w:spacing w:line="240"/>
-      </w:pPr>
-      <w:r>
-        <w:t xml:space="preserve">Student attendance reports and today statistics.</w:t>
+        <w:t xml:space="preserve">M9-10: GitHub Actions — CI/CD</w:t>
+      </w:r>
+    </w:p>
+    <w:p>
+      <w:pPr>
+        <w:spacing w:line="240"/>
+      </w:pPr>
+      <w:r>
+        <w:t xml:space="preserve">CI/CD pipeline: GitHub Actions build + test + deploy workflows for this repository.</w:t>
       </w:r>
     </w:p>
     <w:p>

</xml_diff>